<commit_message>
court(calctapp2d): the proof of service's declaration kept with the declarant's signature (fb-595.54.66)
Co-Authored-By: Claude Opus 5.5 <noreply@anthropic.com>
</commit_message>
<xml_diff>
--- a/courts/ninth-circuit/california/state/court-of-appeal-second-district/petition-for-writ/usage/OUTPUT-petition-for-writ.docx
+++ b/courts/ninth-circuit/california/state/court-of-appeal-second-district/petition-for-writ/usage/OUTPUT-petition-for-writ.docx
@@ -22717,171 +22717,7 @@
     </w:tbl>
     <w:p>
       <w:pPr>
-        <w:spacing w:before="208" w:after="0" w:line="312" w:lineRule="exact"/>
-        <w:ind w:left="0" w:firstLine="0"/>
-        <w:jc w:val="left"/>
-      </w:pPr>
-      <w:r>
-        <w:t xml:space="preserve">I</w:t>
-      </w:r>
-      <w:r>
-        <w:t xml:space="preserve"> </w:t>
-      </w:r>
-      <w:r>
-        <w:t xml:space="preserve">declare</w:t>
-      </w:r>
-      <w:r>
-        <w:t xml:space="preserve"> </w:t>
-      </w:r>
-      <w:r>
-        <w:t xml:space="preserve">under</w:t>
-      </w:r>
-      <w:r>
-        <w:t xml:space="preserve"> </w:t>
-      </w:r>
-      <w:r>
-        <w:t xml:space="preserve">penalty</w:t>
-      </w:r>
-      <w:r>
-        <w:t xml:space="preserve"> </w:t>
-      </w:r>
-      <w:r>
-        <w:t xml:space="preserve">of</w:t>
-      </w:r>
-      <w:r>
-        <w:t xml:space="preserve"> </w:t>
-      </w:r>
-      <w:r>
-        <w:t xml:space="preserve">perjury</w:t>
-      </w:r>
-      <w:r>
-        <w:t xml:space="preserve"> </w:t>
-      </w:r>
-      <w:r>
-        <w:t xml:space="preserve">under</w:t>
-      </w:r>
-      <w:r>
-        <w:t xml:space="preserve"> </w:t>
-      </w:r>
-      <w:r>
-        <w:t xml:space="preserve">the</w:t>
-      </w:r>
-      <w:r>
-        <w:t xml:space="preserve"> </w:t>
-      </w:r>
-      <w:r>
-        <w:t xml:space="preserve">laws</w:t>
-      </w:r>
-      <w:r>
-        <w:t xml:space="preserve"> </w:t>
-      </w:r>
-      <w:r>
-        <w:t xml:space="preserve">of</w:t>
-      </w:r>
-      <w:r>
-        <w:t xml:space="preserve"> </w:t>
-      </w:r>
-      <w:r>
-        <w:t xml:space="preserve">the</w:t>
-      </w:r>
-      <w:r>
-        <w:t xml:space="preserve"> </w:t>
-      </w:r>
-      <w:r>
-        <w:t xml:space="preserve">State</w:t>
-      </w:r>
-      <w:r>
-        <w:t xml:space="preserve"> </w:t>
-      </w:r>
-      <w:r>
-        <w:t xml:space="preserve">of</w:t>
-      </w:r>
-      <w:r>
-        <w:t xml:space="preserve"> </w:t>
-      </w:r>
-      <w:r>
-        <w:t xml:space="preserve">California</w:t>
-      </w:r>
-      <w:r>
-        <w:t xml:space="preserve"> </w:t>
-      </w:r>
-      <w:r>
-        <w:t xml:space="preserve">that</w:t>
-      </w:r>
-      <w:r>
-        <w:t xml:space="preserve"> </w:t>
-      </w:r>
-      <w:r>
-        <w:t xml:space="preserve">the</w:t>
-      </w:r>
-      <w:r>
-        <w:t xml:space="preserve"> </w:t>
-      </w:r>
-      <w:r>
-        <w:t xml:space="preserve">foregoing</w:t>
-      </w:r>
-      <w:r>
-        <w:t xml:space="preserve"> </w:t>
-      </w:r>
-      <w:r>
-        <w:t xml:space="preserve">is</w:t>
-      </w:r>
-      <w:r>
-        <w:t xml:space="preserve"> </w:t>
-      </w:r>
-      <w:r>
-        <w:t xml:space="preserve">true</w:t>
-      </w:r>
-      <w:r>
-        <w:t xml:space="preserve"> </w:t>
-      </w:r>
-      <w:r>
-        <w:t xml:space="preserve">and</w:t>
-      </w:r>
-      <w:r>
-        <w:t xml:space="preserve"> </w:t>
-      </w:r>
-      <w:r>
-        <w:t xml:space="preserve">correct.</w:t>
-      </w:r>
-    </w:p>
-    <w:p>
-      <w:pPr>
-        <w:spacing w:before="208" w:after="0" w:line="312" w:lineRule="exact"/>
-        <w:ind w:left="0" w:firstLine="0"/>
-        <w:jc w:val="left"/>
-      </w:pPr>
-      <w:r>
-        <w:t xml:space="preserve">Executed</w:t>
-      </w:r>
-      <w:r>
-        <w:t xml:space="preserve"> </w:t>
-      </w:r>
-      <w:r>
-        <w:t xml:space="preserve">on</w:t>
-      </w:r>
-      <w:r>
-        <w:t xml:space="preserve"> </w:t>
-      </w:r>
-      <w:r>
-        <w:t xml:space="preserve">[not</w:t>
-      </w:r>
-      <w:r>
-        <w:t xml:space="preserve"> </w:t>
-      </w:r>
-      <w:r>
-        <w:t xml:space="preserve">in</w:t>
-      </w:r>
-      <w:r>
-        <w:t xml:space="preserve"> </w:t>
-      </w:r>
-      <w:r>
-        <w:t xml:space="preserve">exemplar].</w:t>
-      </w:r>
-    </w:p>
-    <w:p>
-      <w:pPr>
-        <w:spacing w:before="0" w:after="0" w:line="364" w:lineRule="exact"/>
+        <w:spacing w:before="0" w:after="0" w:line="208" w:lineRule="exact"/>
       </w:pPr>
     </w:p>
     <w:tbl>
@@ -22910,6 +22746,170 @@
           <w:p>
             <w:pPr>
               <w:spacing w:before="0" w:after="0" w:line="312" w:lineRule="exact"/>
+              <w:ind w:left="0" w:firstLine="0"/>
+              <w:jc w:val="left"/>
+            </w:pPr>
+            <w:r>
+              <w:t xml:space="preserve">I</w:t>
+            </w:r>
+            <w:r>
+              <w:t xml:space="preserve"> </w:t>
+            </w:r>
+            <w:r>
+              <w:t xml:space="preserve">declare</w:t>
+            </w:r>
+            <w:r>
+              <w:t xml:space="preserve"> </w:t>
+            </w:r>
+            <w:r>
+              <w:t xml:space="preserve">under</w:t>
+            </w:r>
+            <w:r>
+              <w:t xml:space="preserve"> </w:t>
+            </w:r>
+            <w:r>
+              <w:t xml:space="preserve">penalty</w:t>
+            </w:r>
+            <w:r>
+              <w:t xml:space="preserve"> </w:t>
+            </w:r>
+            <w:r>
+              <w:t xml:space="preserve">of</w:t>
+            </w:r>
+            <w:r>
+              <w:t xml:space="preserve"> </w:t>
+            </w:r>
+            <w:r>
+              <w:t xml:space="preserve">perjury</w:t>
+            </w:r>
+            <w:r>
+              <w:t xml:space="preserve"> </w:t>
+            </w:r>
+            <w:r>
+              <w:t xml:space="preserve">under</w:t>
+            </w:r>
+            <w:r>
+              <w:t xml:space="preserve"> </w:t>
+            </w:r>
+            <w:r>
+              <w:t xml:space="preserve">the</w:t>
+            </w:r>
+            <w:r>
+              <w:t xml:space="preserve"> </w:t>
+            </w:r>
+            <w:r>
+              <w:t xml:space="preserve">laws</w:t>
+            </w:r>
+            <w:r>
+              <w:t xml:space="preserve"> </w:t>
+            </w:r>
+            <w:r>
+              <w:t xml:space="preserve">of</w:t>
+            </w:r>
+            <w:r>
+              <w:t xml:space="preserve"> </w:t>
+            </w:r>
+            <w:r>
+              <w:t xml:space="preserve">the</w:t>
+            </w:r>
+            <w:r>
+              <w:t xml:space="preserve"> </w:t>
+            </w:r>
+            <w:r>
+              <w:t xml:space="preserve">State</w:t>
+            </w:r>
+            <w:r>
+              <w:t xml:space="preserve"> </w:t>
+            </w:r>
+            <w:r>
+              <w:t xml:space="preserve">of</w:t>
+            </w:r>
+            <w:r>
+              <w:t xml:space="preserve"> </w:t>
+            </w:r>
+            <w:r>
+              <w:t xml:space="preserve">California</w:t>
+            </w:r>
+            <w:r>
+              <w:t xml:space="preserve"> </w:t>
+            </w:r>
+            <w:r>
+              <w:t xml:space="preserve">that</w:t>
+            </w:r>
+            <w:r>
+              <w:t xml:space="preserve"> </w:t>
+            </w:r>
+            <w:r>
+              <w:t xml:space="preserve">the</w:t>
+            </w:r>
+            <w:r>
+              <w:t xml:space="preserve"> </w:t>
+            </w:r>
+            <w:r>
+              <w:t xml:space="preserve">foregoing</w:t>
+            </w:r>
+            <w:r>
+              <w:t xml:space="preserve"> </w:t>
+            </w:r>
+            <w:r>
+              <w:t xml:space="preserve">is</w:t>
+            </w:r>
+            <w:r>
+              <w:t xml:space="preserve"> </w:t>
+            </w:r>
+            <w:r>
+              <w:t xml:space="preserve">true</w:t>
+            </w:r>
+            <w:r>
+              <w:t xml:space="preserve"> </w:t>
+            </w:r>
+            <w:r>
+              <w:t xml:space="preserve">and</w:t>
+            </w:r>
+            <w:r>
+              <w:t xml:space="preserve"> </w:t>
+            </w:r>
+            <w:r>
+              <w:t xml:space="preserve">correct.</w:t>
+            </w:r>
+          </w:p>
+          <w:p>
+            <w:pPr>
+              <w:spacing w:before="208" w:after="0" w:line="312" w:lineRule="exact"/>
+              <w:ind w:left="0" w:firstLine="0"/>
+              <w:jc w:val="left"/>
+            </w:pPr>
+            <w:r>
+              <w:t xml:space="preserve">Executed</w:t>
+            </w:r>
+            <w:r>
+              <w:t xml:space="preserve"> </w:t>
+            </w:r>
+            <w:r>
+              <w:t xml:space="preserve">on</w:t>
+            </w:r>
+            <w:r>
+              <w:t xml:space="preserve"> </w:t>
+            </w:r>
+            <w:r>
+              <w:t xml:space="preserve">[not</w:t>
+            </w:r>
+            <w:r>
+              <w:t xml:space="preserve"> </w:t>
+            </w:r>
+            <w:r>
+              <w:t xml:space="preserve">in</w:t>
+            </w:r>
+            <w:r>
+              <w:t xml:space="preserve"> </w:t>
+            </w:r>
+            <w:r>
+              <w:t xml:space="preserve">exemplar].</w:t>
+            </w:r>
+          </w:p>
+          <w:p>
+            <w:pPr>
+              <w:spacing w:before="364" w:after="0" w:line="312" w:lineRule="exact"/>
               <w:ind w:left="3960" w:firstLine="0"/>
               <w:jc w:val="left"/>
             </w:pPr>

</xml_diff>